<commit_message>
Add presentation and report materials
</commit_message>
<xml_diff>
--- a/reports/Capstone Final Thesis.docx
+++ b/reports/Capstone Final Thesis.docx
@@ -895,7 +895,7 @@
           <w:r>
             <w:fldChar w:fldCharType="separate"/>
           </w:r>
-          <w:hyperlink w:anchor="_Toc229756175" w:history="1">
+          <w:hyperlink w:anchor="_Toc229757946" w:history="1">
             <w:r>
               <w:rPr>
                 <w:rStyle w:val="Kpr"/>
@@ -922,7 +922,7 @@
                 <w:noProof/>
                 <w:webHidden/>
               </w:rPr>
-              <w:instrText xml:space="preserve"> PAGEREF _Toc229756175 \h </w:instrText>
+              <w:instrText xml:space="preserve"> PAGEREF _Toc229757946 \h </w:instrText>
             </w:r>
             <w:r>
               <w:rPr>
@@ -967,7 +967,7 @@
               <w14:ligatures w14:val="standardContextual"/>
             </w:rPr>
           </w:pPr>
-          <w:hyperlink w:anchor="_Toc229756176" w:history="1">
+          <w:hyperlink w:anchor="_Toc229757947" w:history="1">
             <w:r>
               <w:rPr>
                 <w:rStyle w:val="Kpr"/>
@@ -994,7 +994,7 @@
                 <w:noProof/>
                 <w:webHidden/>
               </w:rPr>
-              <w:instrText xml:space="preserve"> PAGEREF _Toc229756176 \h </w:instrText>
+              <w:instrText xml:space="preserve"> PAGEREF _Toc229757947 \h </w:instrText>
             </w:r>
             <w:r>
               <w:rPr>
@@ -1039,7 +1039,7 @@
               <w14:ligatures w14:val="standardContextual"/>
             </w:rPr>
           </w:pPr>
-          <w:hyperlink w:anchor="_Toc229756177" w:history="1">
+          <w:hyperlink w:anchor="_Toc229757948" w:history="1">
             <w:r>
               <w:rPr>
                 <w:rStyle w:val="Kpr"/>
@@ -1066,7 +1066,7 @@
                 <w:noProof/>
                 <w:webHidden/>
               </w:rPr>
-              <w:instrText xml:space="preserve"> PAGEREF _Toc229756177 \h </w:instrText>
+              <w:instrText xml:space="preserve"> PAGEREF _Toc229757948 \h </w:instrText>
             </w:r>
             <w:r>
               <w:rPr>
@@ -1111,7 +1111,7 @@
               <w14:ligatures w14:val="standardContextual"/>
             </w:rPr>
           </w:pPr>
-          <w:hyperlink w:anchor="_Toc229756178" w:history="1">
+          <w:hyperlink w:anchor="_Toc229757949" w:history="1">
             <w:r>
               <w:rPr>
                 <w:rStyle w:val="Kpr"/>
@@ -1138,7 +1138,7 @@
                 <w:noProof/>
                 <w:webHidden/>
               </w:rPr>
-              <w:instrText xml:space="preserve"> PAGEREF _Toc229756178 \h </w:instrText>
+              <w:instrText xml:space="preserve"> PAGEREF _Toc229757949 \h </w:instrText>
             </w:r>
             <w:r>
               <w:rPr>
@@ -1183,7 +1183,7 @@
               <w14:ligatures w14:val="standardContextual"/>
             </w:rPr>
           </w:pPr>
-          <w:hyperlink w:anchor="_Toc229756179" w:history="1">
+          <w:hyperlink w:anchor="_Toc229757950" w:history="1">
             <w:r>
               <w:rPr>
                 <w:rStyle w:val="Kpr"/>
@@ -1210,7 +1210,7 @@
                 <w:noProof/>
                 <w:webHidden/>
               </w:rPr>
-              <w:instrText xml:space="preserve"> PAGEREF _Toc229756179 \h </w:instrText>
+              <w:instrText xml:space="preserve"> PAGEREF _Toc229757950 \h </w:instrText>
             </w:r>
             <w:r>
               <w:rPr>
@@ -1255,7 +1255,7 @@
               <w14:ligatures w14:val="standardContextual"/>
             </w:rPr>
           </w:pPr>
-          <w:hyperlink w:anchor="_Toc229756180" w:history="1">
+          <w:hyperlink w:anchor="_Toc229757951" w:history="1">
             <w:r>
               <w:rPr>
                 <w:rStyle w:val="Kpr"/>
@@ -1282,7 +1282,7 @@
                 <w:noProof/>
                 <w:webHidden/>
               </w:rPr>
-              <w:instrText xml:space="preserve"> PAGEREF _Toc229756180 \h </w:instrText>
+              <w:instrText xml:space="preserve"> PAGEREF _Toc229757951 \h </w:instrText>
             </w:r>
             <w:r>
               <w:rPr>
@@ -1327,7 +1327,7 @@
               <w14:ligatures w14:val="standardContextual"/>
             </w:rPr>
           </w:pPr>
-          <w:hyperlink w:anchor="_Toc229756181" w:history="1">
+          <w:hyperlink w:anchor="_Toc229757952" w:history="1">
             <w:r>
               <w:rPr>
                 <w:rStyle w:val="Kpr"/>
@@ -1354,7 +1354,7 @@
                 <w:noProof/>
                 <w:webHidden/>
               </w:rPr>
-              <w:instrText xml:space="preserve"> PAGEREF _Toc229756181 \h </w:instrText>
+              <w:instrText xml:space="preserve"> PAGEREF _Toc229757952 \h </w:instrText>
             </w:r>
             <w:r>
               <w:rPr>
@@ -1399,7 +1399,7 @@
               <w14:ligatures w14:val="standardContextual"/>
             </w:rPr>
           </w:pPr>
-          <w:hyperlink w:anchor="_Toc229756182" w:history="1">
+          <w:hyperlink w:anchor="_Toc229757953" w:history="1">
             <w:r>
               <w:rPr>
                 <w:rStyle w:val="Kpr"/>
@@ -1426,7 +1426,7 @@
                 <w:noProof/>
                 <w:webHidden/>
               </w:rPr>
-              <w:instrText xml:space="preserve"> PAGEREF _Toc229756182 \h </w:instrText>
+              <w:instrText xml:space="preserve"> PAGEREF _Toc229757953 \h </w:instrText>
             </w:r>
             <w:r>
               <w:rPr>
@@ -1471,7 +1471,7 @@
               <w14:ligatures w14:val="standardContextual"/>
             </w:rPr>
           </w:pPr>
-          <w:hyperlink w:anchor="_Toc229756183" w:history="1">
+          <w:hyperlink w:anchor="_Toc229757954" w:history="1">
             <w:r>
               <w:rPr>
                 <w:rStyle w:val="Kpr"/>
@@ -1498,7 +1498,7 @@
                 <w:noProof/>
                 <w:webHidden/>
               </w:rPr>
-              <w:instrText xml:space="preserve"> PAGEREF _Toc229756183 \h </w:instrText>
+              <w:instrText xml:space="preserve"> PAGEREF _Toc229757954 \h </w:instrText>
             </w:r>
             <w:r>
               <w:rPr>
@@ -1543,7 +1543,7 @@
               <w14:ligatures w14:val="standardContextual"/>
             </w:rPr>
           </w:pPr>
-          <w:hyperlink w:anchor="_Toc229756184" w:history="1">
+          <w:hyperlink w:anchor="_Toc229757955" w:history="1">
             <w:r>
               <w:rPr>
                 <w:rStyle w:val="Kpr"/>
@@ -1570,7 +1570,7 @@
                 <w:noProof/>
                 <w:webHidden/>
               </w:rPr>
-              <w:instrText xml:space="preserve"> PAGEREF _Toc229756184 \h </w:instrText>
+              <w:instrText xml:space="preserve"> PAGEREF _Toc229757955 \h </w:instrText>
             </w:r>
             <w:r>
               <w:rPr>
@@ -1615,7 +1615,7 @@
               <w14:ligatures w14:val="standardContextual"/>
             </w:rPr>
           </w:pPr>
-          <w:hyperlink w:anchor="_Toc229756185" w:history="1">
+          <w:hyperlink w:anchor="_Toc229757956" w:history="1">
             <w:r>
               <w:rPr>
                 <w:rStyle w:val="Kpr"/>
@@ -1642,7 +1642,7 @@
                 <w:noProof/>
                 <w:webHidden/>
               </w:rPr>
-              <w:instrText xml:space="preserve"> PAGEREF _Toc229756185 \h </w:instrText>
+              <w:instrText xml:space="preserve"> PAGEREF _Toc229757956 \h </w:instrText>
             </w:r>
             <w:r>
               <w:rPr>
@@ -1687,7 +1687,7 @@
               <w14:ligatures w14:val="standardContextual"/>
             </w:rPr>
           </w:pPr>
-          <w:hyperlink w:anchor="_Toc229756186" w:history="1">
+          <w:hyperlink w:anchor="_Toc229757957" w:history="1">
             <w:r>
               <w:rPr>
                 <w:rStyle w:val="Kpr"/>
@@ -1714,7 +1714,7 @@
                 <w:noProof/>
                 <w:webHidden/>
               </w:rPr>
-              <w:instrText xml:space="preserve"> PAGEREF _Toc229756186 \h </w:instrText>
+              <w:instrText xml:space="preserve"> PAGEREF _Toc229757957 \h </w:instrText>
             </w:r>
             <w:r>
               <w:rPr>
@@ -1759,7 +1759,7 @@
               <w14:ligatures w14:val="standardContextual"/>
             </w:rPr>
           </w:pPr>
-          <w:hyperlink w:anchor="_Toc229756187" w:history="1">
+          <w:hyperlink w:anchor="_Toc229757958" w:history="1">
             <w:r>
               <w:rPr>
                 <w:rStyle w:val="Kpr"/>
@@ -1786,7 +1786,7 @@
                 <w:noProof/>
                 <w:webHidden/>
               </w:rPr>
-              <w:instrText xml:space="preserve"> PAGEREF _Toc229756187 \h </w:instrText>
+              <w:instrText xml:space="preserve"> PAGEREF _Toc229757958 \h </w:instrText>
             </w:r>
             <w:r>
               <w:rPr>
@@ -1831,7 +1831,7 @@
               <w14:ligatures w14:val="standardContextual"/>
             </w:rPr>
           </w:pPr>
-          <w:hyperlink w:anchor="_Toc229756188" w:history="1">
+          <w:hyperlink w:anchor="_Toc229757959" w:history="1">
             <w:r>
               <w:rPr>
                 <w:rStyle w:val="Kpr"/>
@@ -1858,7 +1858,7 @@
                 <w:noProof/>
                 <w:webHidden/>
               </w:rPr>
-              <w:instrText xml:space="preserve"> PAGEREF _Toc229756188 \h </w:instrText>
+              <w:instrText xml:space="preserve"> PAGEREF _Toc229757959 \h </w:instrText>
             </w:r>
             <w:r>
               <w:rPr>
@@ -1903,7 +1903,7 @@
               <w14:ligatures w14:val="standardContextual"/>
             </w:rPr>
           </w:pPr>
-          <w:hyperlink w:anchor="_Toc229756189" w:history="1">
+          <w:hyperlink w:anchor="_Toc229757960" w:history="1">
             <w:r>
               <w:rPr>
                 <w:rStyle w:val="Kpr"/>
@@ -1930,7 +1930,7 @@
                 <w:noProof/>
                 <w:webHidden/>
               </w:rPr>
-              <w:instrText xml:space="preserve"> PAGEREF _Toc229756189 \h </w:instrText>
+              <w:instrText xml:space="preserve"> PAGEREF _Toc229757960 \h </w:instrText>
             </w:r>
             <w:r>
               <w:rPr>
@@ -1975,7 +1975,7 @@
               <w14:ligatures w14:val="standardContextual"/>
             </w:rPr>
           </w:pPr>
-          <w:hyperlink w:anchor="_Toc229756190" w:history="1">
+          <w:hyperlink w:anchor="_Toc229757961" w:history="1">
             <w:r>
               <w:rPr>
                 <w:rStyle w:val="Kpr"/>
@@ -2002,7 +2002,7 @@
                 <w:noProof/>
                 <w:webHidden/>
               </w:rPr>
-              <w:instrText xml:space="preserve"> PAGEREF _Toc229756190 \h </w:instrText>
+              <w:instrText xml:space="preserve"> PAGEREF _Toc229757961 \h </w:instrText>
             </w:r>
             <w:r>
               <w:rPr>
@@ -2047,7 +2047,7 @@
               <w14:ligatures w14:val="standardContextual"/>
             </w:rPr>
           </w:pPr>
-          <w:hyperlink w:anchor="_Toc229756191" w:history="1">
+          <w:hyperlink w:anchor="_Toc229757962" w:history="1">
             <w:r>
               <w:rPr>
                 <w:rStyle w:val="Kpr"/>
@@ -2074,7 +2074,7 @@
                 <w:noProof/>
                 <w:webHidden/>
               </w:rPr>
-              <w:instrText xml:space="preserve"> PAGEREF _Toc229756191 \h </w:instrText>
+              <w:instrText xml:space="preserve"> PAGEREF _Toc229757962 \h </w:instrText>
             </w:r>
             <w:r>
               <w:rPr>
@@ -2119,7 +2119,7 @@
               <w14:ligatures w14:val="standardContextual"/>
             </w:rPr>
           </w:pPr>
-          <w:hyperlink w:anchor="_Toc229756192" w:history="1">
+          <w:hyperlink w:anchor="_Toc229757963" w:history="1">
             <w:r>
               <w:rPr>
                 <w:rStyle w:val="Kpr"/>
@@ -2146,7 +2146,7 @@
                 <w:noProof/>
                 <w:webHidden/>
               </w:rPr>
-              <w:instrText xml:space="preserve"> PAGEREF _Toc229756192 \h </w:instrText>
+              <w:instrText xml:space="preserve"> PAGEREF _Toc229757963 \h </w:instrText>
             </w:r>
             <w:r>
               <w:rPr>
@@ -2191,7 +2191,7 @@
               <w14:ligatures w14:val="standardContextual"/>
             </w:rPr>
           </w:pPr>
-          <w:hyperlink w:anchor="_Toc229756193" w:history="1">
+          <w:hyperlink w:anchor="_Toc229757964" w:history="1">
             <w:r>
               <w:rPr>
                 <w:rStyle w:val="Kpr"/>
@@ -2218,7 +2218,7 @@
                 <w:noProof/>
                 <w:webHidden/>
               </w:rPr>
-              <w:instrText xml:space="preserve"> PAGEREF _Toc229756193 \h </w:instrText>
+              <w:instrText xml:space="preserve"> PAGEREF _Toc229757964 \h </w:instrText>
             </w:r>
             <w:r>
               <w:rPr>
@@ -2263,7 +2263,7 @@
               <w14:ligatures w14:val="standardContextual"/>
             </w:rPr>
           </w:pPr>
-          <w:hyperlink w:anchor="_Toc229756194" w:history="1">
+          <w:hyperlink w:anchor="_Toc229757965" w:history="1">
             <w:r>
               <w:rPr>
                 <w:rStyle w:val="Kpr"/>
@@ -2290,7 +2290,7 @@
                 <w:noProof/>
                 <w:webHidden/>
               </w:rPr>
-              <w:instrText xml:space="preserve"> PAGEREF _Toc229756194 \h </w:instrText>
+              <w:instrText xml:space="preserve"> PAGEREF _Toc229757965 \h </w:instrText>
             </w:r>
             <w:r>
               <w:rPr>
@@ -2335,7 +2335,7 @@
               <w14:ligatures w14:val="standardContextual"/>
             </w:rPr>
           </w:pPr>
-          <w:hyperlink w:anchor="_Toc229756195" w:history="1">
+          <w:hyperlink w:anchor="_Toc229757966" w:history="1">
             <w:r>
               <w:rPr>
                 <w:rStyle w:val="Kpr"/>
@@ -2362,7 +2362,7 @@
                 <w:noProof/>
                 <w:webHidden/>
               </w:rPr>
-              <w:instrText xml:space="preserve"> PAGEREF _Toc229756195 \h </w:instrText>
+              <w:instrText xml:space="preserve"> PAGEREF _Toc229757966 \h </w:instrText>
             </w:r>
             <w:r>
               <w:rPr>
@@ -2407,7 +2407,7 @@
               <w14:ligatures w14:val="standardContextual"/>
             </w:rPr>
           </w:pPr>
-          <w:hyperlink w:anchor="_Toc229756196" w:history="1">
+          <w:hyperlink w:anchor="_Toc229757967" w:history="1">
             <w:r>
               <w:rPr>
                 <w:rStyle w:val="Kpr"/>
@@ -2434,7 +2434,7 @@
                 <w:noProof/>
                 <w:webHidden/>
               </w:rPr>
-              <w:instrText xml:space="preserve"> PAGEREF _Toc229756196 \h </w:instrText>
+              <w:instrText xml:space="preserve"> PAGEREF _Toc229757967 \h </w:instrText>
             </w:r>
             <w:r>
               <w:rPr>
@@ -2479,7 +2479,7 @@
               <w14:ligatures w14:val="standardContextual"/>
             </w:rPr>
           </w:pPr>
-          <w:hyperlink w:anchor="_Toc229756197" w:history="1">
+          <w:hyperlink w:anchor="_Toc229757968" w:history="1">
             <w:r>
               <w:rPr>
                 <w:rStyle w:val="Kpr"/>
@@ -2506,7 +2506,7 @@
                 <w:noProof/>
                 <w:webHidden/>
               </w:rPr>
-              <w:instrText xml:space="preserve"> PAGEREF _Toc229756197 \h </w:instrText>
+              <w:instrText xml:space="preserve"> PAGEREF _Toc229757968 \h </w:instrText>
             </w:r>
             <w:r>
               <w:rPr>
@@ -2551,7 +2551,7 @@
               <w14:ligatures w14:val="standardContextual"/>
             </w:rPr>
           </w:pPr>
-          <w:hyperlink w:anchor="_Toc229756198" w:history="1">
+          <w:hyperlink w:anchor="_Toc229757969" w:history="1">
             <w:r>
               <w:rPr>
                 <w:rStyle w:val="Kpr"/>
@@ -2578,7 +2578,7 @@
                 <w:noProof/>
                 <w:webHidden/>
               </w:rPr>
-              <w:instrText xml:space="preserve"> PAGEREF _Toc229756198 \h </w:instrText>
+              <w:instrText xml:space="preserve"> PAGEREF _Toc229757969 \h </w:instrText>
             </w:r>
             <w:r>
               <w:rPr>
@@ -2623,7 +2623,7 @@
               <w14:ligatures w14:val="standardContextual"/>
             </w:rPr>
           </w:pPr>
-          <w:hyperlink w:anchor="_Toc229756199" w:history="1">
+          <w:hyperlink w:anchor="_Toc229757970" w:history="1">
             <w:r>
               <w:rPr>
                 <w:rStyle w:val="Kpr"/>
@@ -2650,7 +2650,7 @@
                 <w:noProof/>
                 <w:webHidden/>
               </w:rPr>
-              <w:instrText xml:space="preserve"> PAGEREF _Toc229756199 \h </w:instrText>
+              <w:instrText xml:space="preserve"> PAGEREF _Toc229757970 \h </w:instrText>
             </w:r>
             <w:r>
               <w:rPr>
@@ -2695,7 +2695,7 @@
               <w14:ligatures w14:val="standardContextual"/>
             </w:rPr>
           </w:pPr>
-          <w:hyperlink w:anchor="_Toc229756200" w:history="1">
+          <w:hyperlink w:anchor="_Toc229757971" w:history="1">
             <w:r>
               <w:rPr>
                 <w:rStyle w:val="Kpr"/>
@@ -2722,7 +2722,7 @@
                 <w:noProof/>
                 <w:webHidden/>
               </w:rPr>
-              <w:instrText xml:space="preserve"> PAGEREF _Toc229756200 \h </w:instrText>
+              <w:instrText xml:space="preserve"> PAGEREF _Toc229757971 \h </w:instrText>
             </w:r>
             <w:r>
               <w:rPr>
@@ -2767,7 +2767,7 @@
               <w14:ligatures w14:val="standardContextual"/>
             </w:rPr>
           </w:pPr>
-          <w:hyperlink w:anchor="_Toc229756201" w:history="1">
+          <w:hyperlink w:anchor="_Toc229757972" w:history="1">
             <w:r>
               <w:rPr>
                 <w:rStyle w:val="Kpr"/>
@@ -2794,7 +2794,7 @@
                 <w:noProof/>
                 <w:webHidden/>
               </w:rPr>
-              <w:instrText xml:space="preserve"> PAGEREF _Toc229756201 \h </w:instrText>
+              <w:instrText xml:space="preserve"> PAGEREF _Toc229757972 \h </w:instrText>
             </w:r>
             <w:r>
               <w:rPr>
@@ -2839,7 +2839,7 @@
               <w14:ligatures w14:val="standardContextual"/>
             </w:rPr>
           </w:pPr>
-          <w:hyperlink w:anchor="_Toc229756202" w:history="1">
+          <w:hyperlink w:anchor="_Toc229757973" w:history="1">
             <w:r>
               <w:rPr>
                 <w:rStyle w:val="Kpr"/>
@@ -2866,7 +2866,7 @@
                 <w:noProof/>
                 <w:webHidden/>
               </w:rPr>
-              <w:instrText xml:space="preserve"> PAGEREF _Toc229756202 \h </w:instrText>
+              <w:instrText xml:space="preserve"> PAGEREF _Toc229757973 \h </w:instrText>
             </w:r>
             <w:r>
               <w:rPr>
@@ -2911,7 +2911,7 @@
               <w14:ligatures w14:val="standardContextual"/>
             </w:rPr>
           </w:pPr>
-          <w:hyperlink w:anchor="_Toc229756203" w:history="1">
+          <w:hyperlink w:anchor="_Toc229757974" w:history="1">
             <w:r>
               <w:rPr>
                 <w:rStyle w:val="Kpr"/>
@@ -2938,7 +2938,7 @@
                 <w:noProof/>
                 <w:webHidden/>
               </w:rPr>
-              <w:instrText xml:space="preserve"> PAGEREF _Toc229756203 \h </w:instrText>
+              <w:instrText xml:space="preserve"> PAGEREF _Toc229757974 \h </w:instrText>
             </w:r>
             <w:r>
               <w:rPr>
@@ -2983,7 +2983,7 @@
               <w14:ligatures w14:val="standardContextual"/>
             </w:rPr>
           </w:pPr>
-          <w:hyperlink w:anchor="_Toc229756204" w:history="1">
+          <w:hyperlink w:anchor="_Toc229757975" w:history="1">
             <w:r>
               <w:rPr>
                 <w:rStyle w:val="Kpr"/>
@@ -3010,7 +3010,7 @@
                 <w:noProof/>
                 <w:webHidden/>
               </w:rPr>
-              <w:instrText xml:space="preserve"> PAGEREF _Toc229756204 \h </w:instrText>
+              <w:instrText xml:space="preserve"> PAGEREF _Toc229757975 \h </w:instrText>
             </w:r>
             <w:r>
               <w:rPr>
@@ -3055,7 +3055,7 @@
               <w14:ligatures w14:val="standardContextual"/>
             </w:rPr>
           </w:pPr>
-          <w:hyperlink w:anchor="_Toc229756205" w:history="1">
+          <w:hyperlink w:anchor="_Toc229757976" w:history="1">
             <w:r>
               <w:rPr>
                 <w:rStyle w:val="Kpr"/>
@@ -3082,7 +3082,7 @@
                 <w:noProof/>
                 <w:webHidden/>
               </w:rPr>
-              <w:instrText xml:space="preserve"> PAGEREF _Toc229756205 \h </w:instrText>
+              <w:instrText xml:space="preserve"> PAGEREF _Toc229757976 \h </w:instrText>
             </w:r>
             <w:r>
               <w:rPr>
@@ -3127,7 +3127,7 @@
               <w14:ligatures w14:val="standardContextual"/>
             </w:rPr>
           </w:pPr>
-          <w:hyperlink w:anchor="_Toc229756206" w:history="1">
+          <w:hyperlink w:anchor="_Toc229757977" w:history="1">
             <w:r>
               <w:rPr>
                 <w:rStyle w:val="Kpr"/>
@@ -3154,7 +3154,7 @@
                 <w:noProof/>
                 <w:webHidden/>
               </w:rPr>
-              <w:instrText xml:space="preserve"> PAGEREF _Toc229756206 \h </w:instrText>
+              <w:instrText xml:space="preserve"> PAGEREF _Toc229757977 \h </w:instrText>
             </w:r>
             <w:r>
               <w:rPr>
@@ -3199,7 +3199,7 @@
               <w14:ligatures w14:val="standardContextual"/>
             </w:rPr>
           </w:pPr>
-          <w:hyperlink w:anchor="_Toc229756207" w:history="1">
+          <w:hyperlink w:anchor="_Toc229757978" w:history="1">
             <w:r>
               <w:rPr>
                 <w:rStyle w:val="Kpr"/>
@@ -3226,7 +3226,7 @@
                 <w:noProof/>
                 <w:webHidden/>
               </w:rPr>
-              <w:instrText xml:space="preserve"> PAGEREF _Toc229756207 \h </w:instrText>
+              <w:instrText xml:space="preserve"> PAGEREF _Toc229757978 \h </w:instrText>
             </w:r>
             <w:r>
               <w:rPr>
@@ -3271,7 +3271,7 @@
               <w14:ligatures w14:val="standardContextual"/>
             </w:rPr>
           </w:pPr>
-          <w:hyperlink w:anchor="_Toc229756208" w:history="1">
+          <w:hyperlink w:anchor="_Toc229757979" w:history="1">
             <w:r>
               <w:rPr>
                 <w:rStyle w:val="Kpr"/>
@@ -3298,7 +3298,7 @@
                 <w:noProof/>
                 <w:webHidden/>
               </w:rPr>
-              <w:instrText xml:space="preserve"> PAGEREF _Toc229756208 \h </w:instrText>
+              <w:instrText xml:space="preserve"> PAGEREF _Toc229757979 \h </w:instrText>
             </w:r>
             <w:r>
               <w:rPr>
@@ -3318,7 +3318,7 @@
                 <w:noProof/>
                 <w:webHidden/>
               </w:rPr>
-              <w:t>18</w:t>
+              <w:t>19</w:t>
             </w:r>
             <w:r>
               <w:rPr>
@@ -3343,7 +3343,7 @@
               <w14:ligatures w14:val="standardContextual"/>
             </w:rPr>
           </w:pPr>
-          <w:hyperlink w:anchor="_Toc229756209" w:history="1">
+          <w:hyperlink w:anchor="_Toc229757980" w:history="1">
             <w:r>
               <w:rPr>
                 <w:rStyle w:val="Kpr"/>
@@ -3370,7 +3370,7 @@
                 <w:noProof/>
                 <w:webHidden/>
               </w:rPr>
-              <w:instrText xml:space="preserve"> PAGEREF _Toc229756209 \h </w:instrText>
+              <w:instrText xml:space="preserve"> PAGEREF _Toc229757980 \h </w:instrText>
             </w:r>
             <w:r>
               <w:rPr>
@@ -3390,7 +3390,7 @@
                 <w:noProof/>
                 <w:webHidden/>
               </w:rPr>
-              <w:t>18</w:t>
+              <w:t>19</w:t>
             </w:r>
             <w:r>
               <w:rPr>
@@ -3415,7 +3415,7 @@
               <w14:ligatures w14:val="standardContextual"/>
             </w:rPr>
           </w:pPr>
-          <w:hyperlink w:anchor="_Toc229756210" w:history="1">
+          <w:hyperlink w:anchor="_Toc229757981" w:history="1">
             <w:r>
               <w:rPr>
                 <w:rStyle w:val="Kpr"/>
@@ -3442,7 +3442,7 @@
                 <w:noProof/>
                 <w:webHidden/>
               </w:rPr>
-              <w:instrText xml:space="preserve"> PAGEREF _Toc229756210 \h </w:instrText>
+              <w:instrText xml:space="preserve"> PAGEREF _Toc229757981 \h </w:instrText>
             </w:r>
             <w:r>
               <w:rPr>
@@ -3462,7 +3462,7 @@
                 <w:noProof/>
                 <w:webHidden/>
               </w:rPr>
-              <w:t>19</w:t>
+              <w:t>20</w:t>
             </w:r>
             <w:r>
               <w:rPr>
@@ -3487,7 +3487,7 @@
               <w14:ligatures w14:val="standardContextual"/>
             </w:rPr>
           </w:pPr>
-          <w:hyperlink w:anchor="_Toc229756211" w:history="1">
+          <w:hyperlink w:anchor="_Toc229757982" w:history="1">
             <w:r>
               <w:rPr>
                 <w:rStyle w:val="Kpr"/>
@@ -3514,7 +3514,7 @@
                 <w:noProof/>
                 <w:webHidden/>
               </w:rPr>
-              <w:instrText xml:space="preserve"> PAGEREF _Toc229756211 \h </w:instrText>
+              <w:instrText xml:space="preserve"> PAGEREF _Toc229757982 \h </w:instrText>
             </w:r>
             <w:r>
               <w:rPr>
@@ -3534,7 +3534,7 @@
                 <w:noProof/>
                 <w:webHidden/>
               </w:rPr>
-              <w:t>21</w:t>
+              <w:t>22</w:t>
             </w:r>
             <w:r>
               <w:rPr>
@@ -3559,7 +3559,7 @@
               <w14:ligatures w14:val="standardContextual"/>
             </w:rPr>
           </w:pPr>
-          <w:hyperlink w:anchor="_Toc229756212" w:history="1">
+          <w:hyperlink w:anchor="_Toc229757983" w:history="1">
             <w:r>
               <w:rPr>
                 <w:rStyle w:val="Kpr"/>
@@ -3586,7 +3586,7 @@
                 <w:noProof/>
                 <w:webHidden/>
               </w:rPr>
-              <w:instrText xml:space="preserve"> PAGEREF _Toc229756212 \h </w:instrText>
+              <w:instrText xml:space="preserve"> PAGEREF _Toc229757983 \h </w:instrText>
             </w:r>
             <w:r>
               <w:rPr>
@@ -3606,7 +3606,7 @@
                 <w:noProof/>
                 <w:webHidden/>
               </w:rPr>
-              <w:t>21</w:t>
+              <w:t>22</w:t>
             </w:r>
             <w:r>
               <w:rPr>
@@ -3631,7 +3631,7 @@
               <w14:ligatures w14:val="standardContextual"/>
             </w:rPr>
           </w:pPr>
-          <w:hyperlink w:anchor="_Toc229756213" w:history="1">
+          <w:hyperlink w:anchor="_Toc229757984" w:history="1">
             <w:r>
               <w:rPr>
                 <w:rStyle w:val="Kpr"/>
@@ -3658,7 +3658,7 @@
                 <w:noProof/>
                 <w:webHidden/>
               </w:rPr>
-              <w:instrText xml:space="preserve"> PAGEREF _Toc229756213 \h </w:instrText>
+              <w:instrText xml:space="preserve"> PAGEREF _Toc229757984 \h </w:instrText>
             </w:r>
             <w:r>
               <w:rPr>
@@ -3678,7 +3678,7 @@
                 <w:noProof/>
                 <w:webHidden/>
               </w:rPr>
-              <w:t>21</w:t>
+              <w:t>22</w:t>
             </w:r>
             <w:r>
               <w:rPr>
@@ -3703,7 +3703,7 @@
               <w14:ligatures w14:val="standardContextual"/>
             </w:rPr>
           </w:pPr>
-          <w:hyperlink w:anchor="_Toc229756214" w:history="1">
+          <w:hyperlink w:anchor="_Toc229757985" w:history="1">
             <w:r>
               <w:rPr>
                 <w:rStyle w:val="Kpr"/>
@@ -3730,7 +3730,7 @@
                 <w:noProof/>
                 <w:webHidden/>
               </w:rPr>
-              <w:instrText xml:space="preserve"> PAGEREF _Toc229756214 \h </w:instrText>
+              <w:instrText xml:space="preserve"> PAGEREF _Toc229757985 \h </w:instrText>
             </w:r>
             <w:r>
               <w:rPr>
@@ -3750,7 +3750,7 @@
                 <w:noProof/>
                 <w:webHidden/>
               </w:rPr>
-              <w:t>21</w:t>
+              <w:t>22</w:t>
             </w:r>
             <w:r>
               <w:rPr>
@@ -3775,7 +3775,7 @@
               <w14:ligatures w14:val="standardContextual"/>
             </w:rPr>
           </w:pPr>
-          <w:hyperlink w:anchor="_Toc229756215" w:history="1">
+          <w:hyperlink w:anchor="_Toc229757986" w:history="1">
             <w:r>
               <w:rPr>
                 <w:rStyle w:val="Kpr"/>
@@ -3802,7 +3802,7 @@
                 <w:noProof/>
                 <w:webHidden/>
               </w:rPr>
-              <w:instrText xml:space="preserve"> PAGEREF _Toc229756215 \h </w:instrText>
+              <w:instrText xml:space="preserve"> PAGEREF _Toc229757986 \h </w:instrText>
             </w:r>
             <w:r>
               <w:rPr>
@@ -3822,7 +3822,7 @@
                 <w:noProof/>
                 <w:webHidden/>
               </w:rPr>
-              <w:t>21</w:t>
+              <w:t>22</w:t>
             </w:r>
             <w:r>
               <w:rPr>
@@ -3847,7 +3847,7 @@
               <w14:ligatures w14:val="standardContextual"/>
             </w:rPr>
           </w:pPr>
-          <w:hyperlink w:anchor="_Toc229756216" w:history="1">
+          <w:hyperlink w:anchor="_Toc229757987" w:history="1">
             <w:r>
               <w:rPr>
                 <w:rStyle w:val="Kpr"/>
@@ -3874,7 +3874,7 @@
                 <w:noProof/>
                 <w:webHidden/>
               </w:rPr>
-              <w:instrText xml:space="preserve"> PAGEREF _Toc229756216 \h </w:instrText>
+              <w:instrText xml:space="preserve"> PAGEREF _Toc229757987 \h </w:instrText>
             </w:r>
             <w:r>
               <w:rPr>
@@ -3894,7 +3894,7 @@
                 <w:noProof/>
                 <w:webHidden/>
               </w:rPr>
-              <w:t>21</w:t>
+              <w:t>22</w:t>
             </w:r>
             <w:r>
               <w:rPr>
@@ -6024,7 +6024,7 @@
           <w:tab w:val="left" w:pos="360"/>
         </w:tabs>
       </w:pPr>
-      <w:bookmarkStart w:id="0" w:name="_Toc229756175"/>
+      <w:bookmarkStart w:id="0" w:name="_Toc229757946"/>
       <w:r>
         <w:lastRenderedPageBreak/>
         <w:t>1</w:t>
@@ -6054,7 +6054,7 @@
         </w:rPr>
         <w:t xml:space="preserve"> </w:t>
       </w:r>
-      <w:bookmarkStart w:id="1" w:name="_Toc229756176"/>
+      <w:bookmarkStart w:id="1" w:name="_Toc229757947"/>
       <w:r>
         <w:rPr>
           <w:rFonts w:ascii="Times New Roman" w:hAnsi="Times New Roman"/>
@@ -6079,7 +6079,7 @@
           <w:numId w:val="0"/>
         </w:numPr>
       </w:pPr>
-      <w:bookmarkStart w:id="2" w:name="_Toc229756177"/>
+      <w:bookmarkStart w:id="2" w:name="_Toc229757948"/>
       <w:r>
         <w:rPr>
           <w:rFonts w:ascii="Times New Roman" w:hAnsi="Times New Roman"/>
@@ -6107,7 +6107,7 @@
           <w:tab w:val="left" w:pos="540"/>
         </w:tabs>
       </w:pPr>
-      <w:bookmarkStart w:id="3" w:name="_Toc229756178"/>
+      <w:bookmarkStart w:id="3" w:name="_Toc229757949"/>
       <w:r>
         <w:rPr>
           <w:rFonts w:ascii="Times New Roman" w:hAnsi="Times New Roman"/>
@@ -6132,7 +6132,7 @@
           <w:numId w:val="0"/>
         </w:numPr>
       </w:pPr>
-      <w:bookmarkStart w:id="4" w:name="_Toc229756179"/>
+      <w:bookmarkStart w:id="4" w:name="_Toc229757950"/>
       <w:r>
         <w:rPr>
           <w:rFonts w:ascii="Times New Roman" w:hAnsi="Times New Roman"/>
@@ -6157,7 +6157,7 @@
           <w:numId w:val="0"/>
         </w:numPr>
       </w:pPr>
-      <w:bookmarkStart w:id="5" w:name="_Toc229756180"/>
+      <w:bookmarkStart w:id="5" w:name="_Toc229757951"/>
       <w:r>
         <w:rPr>
           <w:rFonts w:ascii="Times New Roman" w:hAnsi="Times New Roman"/>
@@ -6183,7 +6183,7 @@
         </w:numPr>
         <w:ind w:left="360" w:hanging="360"/>
       </w:pPr>
-      <w:bookmarkStart w:id="6" w:name="_Toc229756181"/>
+      <w:bookmarkStart w:id="6" w:name="_Toc229757952"/>
       <w:r>
         <w:rPr>
           <w:rFonts w:ascii="Times New Roman" w:hAnsi="Times New Roman"/>
@@ -6210,7 +6210,7 @@
         </w:numPr>
         <w:ind w:left="360"/>
       </w:pPr>
-      <w:bookmarkStart w:id="7" w:name="_Toc229756182"/>
+      <w:bookmarkStart w:id="7" w:name="_Toc229757953"/>
       <w:r>
         <w:t>1.7</w:t>
       </w:r>
@@ -6394,7 +6394,7 @@
           <w:rFonts w:ascii="Times New Roman" w:hAnsi="Times New Roman"/>
         </w:rPr>
       </w:pPr>
-      <w:bookmarkStart w:id="8" w:name="_Toc229756183"/>
+      <w:bookmarkStart w:id="8" w:name="_Toc229757954"/>
       <w:r>
         <w:rPr>
           <w:rFonts w:ascii="Times New Roman" w:hAnsi="Times New Roman"/>
@@ -6427,7 +6427,7 @@
           <w:tab w:val="left" w:pos="360"/>
         </w:tabs>
       </w:pPr>
-      <w:bookmarkStart w:id="9" w:name="_Toc229756184"/>
+      <w:bookmarkStart w:id="9" w:name="_Toc229757955"/>
       <w:r>
         <w:rPr>
           <w:rFonts w:ascii="Times New Roman" w:hAnsi="Times New Roman"/>
@@ -6453,7 +6453,7 @@
         </w:numPr>
         <w:ind w:left="360" w:hanging="360"/>
       </w:pPr>
-      <w:bookmarkStart w:id="10" w:name="_Toc229756185"/>
+      <w:bookmarkStart w:id="10" w:name="_Toc229757956"/>
       <w:r>
         <w:rPr>
           <w:rFonts w:ascii="Times New Roman" w:hAnsi="Times New Roman"/>
@@ -6488,7 +6488,7 @@
         </w:tabs>
         <w:ind w:left="360"/>
       </w:pPr>
-      <w:bookmarkStart w:id="11" w:name="_Toc229756186"/>
+      <w:bookmarkStart w:id="11" w:name="_Toc229757957"/>
       <w:r>
         <w:rPr>
           <w:rFonts w:ascii="Times New Roman" w:hAnsi="Times New Roman"/>
@@ -6519,7 +6519,7 @@
           <w:numId w:val="0"/>
         </w:numPr>
       </w:pPr>
-      <w:bookmarkStart w:id="12" w:name="_Toc229756187"/>
+      <w:bookmarkStart w:id="12" w:name="_Toc229757958"/>
       <w:r>
         <w:rPr>
           <w:rFonts w:ascii="Times New Roman" w:hAnsi="Times New Roman"/>
@@ -6545,7 +6545,7 @@
         </w:numPr>
         <w:ind w:left="360" w:hanging="360"/>
       </w:pPr>
-      <w:bookmarkStart w:id="13" w:name="_Toc229756188"/>
+      <w:bookmarkStart w:id="13" w:name="_Toc229757959"/>
       <w:r>
         <w:rPr>
           <w:rFonts w:ascii="Times New Roman" w:hAnsi="Times New Roman"/>
@@ -6577,7 +6577,7 @@
         </w:numPr>
         <w:ind w:left="360" w:hanging="360"/>
       </w:pPr>
-      <w:bookmarkStart w:id="14" w:name="_Toc229756189"/>
+      <w:bookmarkStart w:id="14" w:name="_Toc229757960"/>
       <w:r>
         <w:rPr>
           <w:rFonts w:ascii="Times New Roman" w:hAnsi="Times New Roman"/>
@@ -6614,7 +6614,7 @@
           <w:numId w:val="0"/>
         </w:numPr>
       </w:pPr>
-      <w:bookmarkStart w:id="15" w:name="_Toc229756190"/>
+      <w:bookmarkStart w:id="15" w:name="_Toc229757961"/>
       <w:r>
         <w:t>2.7</w:t>
       </w:r>
@@ -7858,12 +7858,14 @@
         </w:numPr>
         <w:ind w:left="360"/>
       </w:pPr>
+      <w:bookmarkStart w:id="17" w:name="_Toc229757962"/>
       <w:r>
         <w:rPr>
           <w:rFonts w:ascii="Times New Roman" w:hAnsi="Times New Roman"/>
         </w:rPr>
         <w:t>2.8 Research Gap</w:t>
       </w:r>
+      <w:bookmarkEnd w:id="17"/>
     </w:p>
     <w:p>
       <w:r>
@@ -8026,7 +8028,7 @@
           <w:szCs w:val="32"/>
         </w:rPr>
       </w:pPr>
-      <w:bookmarkStart w:id="17" w:name="_Toc229756192"/>
+      <w:bookmarkStart w:id="18" w:name="_Toc229757963"/>
       <w:r>
         <w:lastRenderedPageBreak/>
         <w:t>3.</w:t>
@@ -8034,7 +8036,7 @@
       <w:r>
         <w:t xml:space="preserve"> Methodology</w:t>
       </w:r>
-      <w:bookmarkEnd w:id="17"/>
+      <w:bookmarkEnd w:id="18"/>
       <w:r>
         <w:br/>
       </w:r>
@@ -8047,14 +8049,14 @@
           <w:numId w:val="0"/>
         </w:numPr>
       </w:pPr>
-      <w:bookmarkStart w:id="18" w:name="_Toc229756193"/>
+      <w:bookmarkStart w:id="19" w:name="_Toc229757964"/>
       <w:r>
         <w:rPr>
           <w:rStyle w:val="Balk2Char"/>
         </w:rPr>
         <w:t>3.1 Research Design</w:t>
       </w:r>
-      <w:bookmarkEnd w:id="18"/>
+      <w:bookmarkEnd w:id="19"/>
     </w:p>
     <w:p>
       <w:r>
@@ -8072,14 +8074,14 @@
           <w:numId w:val="0"/>
         </w:numPr>
       </w:pPr>
-      <w:bookmarkStart w:id="19" w:name="_Toc229756194"/>
+      <w:bookmarkStart w:id="20" w:name="_Toc229757965"/>
       <w:r>
         <w:rPr>
           <w:rFonts w:ascii="Times New Roman" w:hAnsi="Times New Roman"/>
         </w:rPr>
         <w:t>3.2 Dataset and Case Description</w:t>
       </w:r>
-      <w:bookmarkEnd w:id="19"/>
+      <w:bookmarkEnd w:id="20"/>
     </w:p>
     <w:p>
       <w:r>
@@ -8101,14 +8103,14 @@
         </w:tabs>
         <w:ind w:left="360"/>
       </w:pPr>
-      <w:bookmarkStart w:id="20" w:name="_Toc229756195"/>
+      <w:bookmarkStart w:id="21" w:name="_Toc229757966"/>
       <w:r>
         <w:rPr>
           <w:rFonts w:ascii="Times New Roman" w:hAnsi="Times New Roman"/>
         </w:rPr>
         <w:t>3.3 Parsing and Preprocessing Pipeline</w:t>
       </w:r>
-      <w:bookmarkEnd w:id="20"/>
+      <w:bookmarkEnd w:id="21"/>
     </w:p>
     <w:p>
       <w:r>
@@ -8126,14 +8128,14 @@
           <w:numId w:val="0"/>
         </w:numPr>
       </w:pPr>
-      <w:bookmarkStart w:id="21" w:name="_Toc229756196"/>
+      <w:bookmarkStart w:id="22" w:name="_Toc229757967"/>
       <w:r>
         <w:rPr>
           <w:rFonts w:ascii="Times New Roman" w:hAnsi="Times New Roman"/>
         </w:rPr>
         <w:t>3.4 Thread-Based Window Construction</w:t>
       </w:r>
-      <w:bookmarkEnd w:id="21"/>
+      <w:bookmarkEnd w:id="22"/>
     </w:p>
     <w:p>
       <w:r>
@@ -8151,14 +8153,14 @@
           <w:numId w:val="0"/>
         </w:numPr>
       </w:pPr>
-      <w:bookmarkStart w:id="22" w:name="_Toc229756197"/>
+      <w:bookmarkStart w:id="23" w:name="_Toc229757968"/>
       <w:r>
         <w:rPr>
           <w:rFonts w:ascii="Times New Roman" w:hAnsi="Times New Roman"/>
         </w:rPr>
         <w:t>3.5 Feature Encoding</w:t>
       </w:r>
-      <w:bookmarkEnd w:id="22"/>
+      <w:bookmarkEnd w:id="23"/>
     </w:p>
     <w:p>
       <w:r>
@@ -8177,14 +8179,14 @@
         </w:numPr>
         <w:ind w:left="360"/>
       </w:pPr>
-      <w:bookmarkStart w:id="23" w:name="_Toc229756198"/>
+      <w:bookmarkStart w:id="24" w:name="_Toc229757969"/>
       <w:r>
         <w:rPr>
           <w:rFonts w:ascii="Times New Roman" w:hAnsi="Times New Roman"/>
         </w:rPr>
         <w:t>3.6 Models and Training Configuration</w:t>
       </w:r>
-      <w:bookmarkEnd w:id="23"/>
+      <w:bookmarkEnd w:id="24"/>
     </w:p>
     <w:p>
       <w:r>
@@ -8209,14 +8211,14 @@
           <w:numId w:val="0"/>
         </w:numPr>
       </w:pPr>
-      <w:bookmarkStart w:id="24" w:name="_Toc229756199"/>
+      <w:bookmarkStart w:id="25" w:name="_Toc229757970"/>
       <w:r>
         <w:rPr>
           <w:rFonts w:ascii="Times New Roman" w:hAnsi="Times New Roman"/>
         </w:rPr>
         <w:t>3.7 Trace-Level Aggregation and Thresholding</w:t>
       </w:r>
-      <w:bookmarkEnd w:id="24"/>
+      <w:bookmarkEnd w:id="25"/>
     </w:p>
     <w:p>
       <w:r>
@@ -8235,14 +8237,14 @@
         </w:numPr>
         <w:ind w:left="360"/>
       </w:pPr>
-      <w:bookmarkStart w:id="25" w:name="_Toc229756200"/>
+      <w:bookmarkStart w:id="26" w:name="_Toc229757971"/>
       <w:r>
         <w:rPr>
           <w:rFonts w:ascii="Times New Roman" w:hAnsi="Times New Roman"/>
         </w:rPr>
         <w:t>3.8 Evaluation Metrics</w:t>
       </w:r>
-      <w:bookmarkEnd w:id="25"/>
+      <w:bookmarkEnd w:id="26"/>
     </w:p>
     <w:p>
       <w:r>
@@ -8260,14 +8262,14 @@
           <w:numId w:val="0"/>
         </w:numPr>
       </w:pPr>
-      <w:bookmarkStart w:id="26" w:name="_Toc229756201"/>
+      <w:bookmarkStart w:id="27" w:name="_Toc229757972"/>
       <w:r>
         <w:rPr>
           <w:rFonts w:ascii="Times New Roman" w:hAnsi="Times New Roman"/>
         </w:rPr>
         <w:t>3.9 Implementation Environment and Repository Structure</w:t>
       </w:r>
-      <w:bookmarkEnd w:id="26"/>
+      <w:bookmarkEnd w:id="27"/>
     </w:p>
     <w:p>
       <w:r>
@@ -8285,14 +8287,14 @@
           <w:numId w:val="0"/>
         </w:numPr>
       </w:pPr>
-      <w:bookmarkStart w:id="27" w:name="_Toc229756202"/>
+      <w:bookmarkStart w:id="28" w:name="_Toc229757973"/>
       <w:r>
         <w:rPr>
           <w:rFonts w:ascii="Times New Roman" w:hAnsi="Times New Roman"/>
         </w:rPr>
         <w:t>3.10 Dataset and Experimental Setup Summary</w:t>
       </w:r>
-      <w:bookmarkEnd w:id="27"/>
+      <w:bookmarkEnd w:id="28"/>
     </w:p>
     <w:p/>
     <w:p>
@@ -8306,7 +8308,7 @@
         <w:pStyle w:val="ResimYazs"/>
         <w:keepNext/>
       </w:pPr>
-      <w:bookmarkStart w:id="28" w:name="_Toc229756741"/>
+      <w:bookmarkStart w:id="29" w:name="_Toc229756741"/>
       <w:r>
         <w:t xml:space="preserve">Table </w:t>
       </w:r>
@@ -8324,7 +8326,7 @@
       <w:r>
         <w:t>Dataset and experimental setup used in this project.</w:t>
       </w:r>
-      <w:bookmarkEnd w:id="28"/>
+      <w:bookmarkEnd w:id="29"/>
     </w:p>
     <w:tbl>
       <w:tblPr>
@@ -9065,7 +9067,7 @@
           <w:rFonts w:ascii="Times New Roman" w:hAnsi="Times New Roman"/>
         </w:rPr>
       </w:pPr>
-      <w:bookmarkStart w:id="29" w:name="_Toc229756203"/>
+      <w:bookmarkStart w:id="30" w:name="_Toc229757974"/>
       <w:r>
         <w:rPr>
           <w:rFonts w:ascii="Times New Roman" w:hAnsi="Times New Roman"/>
@@ -9085,7 +9087,7 @@
         </w:rPr>
         <w:t xml:space="preserve"> Results</w:t>
       </w:r>
-      <w:bookmarkEnd w:id="29"/>
+      <w:bookmarkEnd w:id="30"/>
     </w:p>
     <w:p>
       <w:pPr>
@@ -9096,7 +9098,7 @@
         </w:numPr>
         <w:ind w:left="360" w:hanging="360"/>
       </w:pPr>
-      <w:bookmarkStart w:id="30" w:name="_Toc229756204"/>
+      <w:bookmarkStart w:id="31" w:name="_Toc229757975"/>
       <w:r>
         <w:rPr>
           <w:rFonts w:ascii="Times New Roman" w:hAnsi="Times New Roman"/>
@@ -9109,7 +9111,7 @@
         </w:rPr>
         <w:t xml:space="preserve"> Experimental Setup and Operating Points</w:t>
       </w:r>
-      <w:bookmarkEnd w:id="30"/>
+      <w:bookmarkEnd w:id="31"/>
     </w:p>
     <w:p>
       <w:r>
@@ -9127,14 +9129,14 @@
           <w:numId w:val="0"/>
         </w:numPr>
       </w:pPr>
-      <w:bookmarkStart w:id="31" w:name="_Toc229756205"/>
+      <w:bookmarkStart w:id="32" w:name="_Toc229757976"/>
       <w:r>
         <w:rPr>
           <w:rFonts w:ascii="Times New Roman" w:hAnsi="Times New Roman"/>
         </w:rPr>
         <w:t>4.2 ROC-AUC Summary</w:t>
       </w:r>
-      <w:bookmarkEnd w:id="31"/>
+      <w:bookmarkEnd w:id="32"/>
     </w:p>
     <w:p/>
     <w:p>
@@ -9156,7 +9158,7 @@
         <w:pStyle w:val="ResimYazs"/>
         <w:keepNext/>
       </w:pPr>
-      <w:bookmarkStart w:id="32" w:name="_Toc229756742"/>
+      <w:bookmarkStart w:id="33" w:name="_Toc229756742"/>
       <w:r>
         <w:t xml:space="preserve">Table </w:t>
       </w:r>
@@ -9174,7 +9176,7 @@
       <w:r>
         <w:t>ROC-AUC comparison on test traces.</w:t>
       </w:r>
-      <w:bookmarkEnd w:id="32"/>
+      <w:bookmarkEnd w:id="33"/>
     </w:p>
     <w:tbl>
       <w:tblPr>
@@ -9391,7 +9393,7 @@
         <w:pStyle w:val="ResimYazs"/>
         <w:jc w:val="center"/>
       </w:pPr>
-      <w:bookmarkStart w:id="33" w:name="_Toc229757143"/>
+      <w:bookmarkStart w:id="34" w:name="_Toc229757143"/>
       <w:r>
         <w:t xml:space="preserve">Figure </w:t>
       </w:r>
@@ -9409,7 +9411,7 @@
       <w:r>
         <w:t>Combined ROC curves for STIDE, LSTM Syscall, and LSTM Context.</w:t>
       </w:r>
-      <w:bookmarkEnd w:id="33"/>
+      <w:bookmarkEnd w:id="34"/>
     </w:p>
     <w:p>
       <w:pPr>
@@ -9432,14 +9434,14 @@
           <w:numId w:val="0"/>
         </w:numPr>
       </w:pPr>
-      <w:bookmarkStart w:id="34" w:name="_Toc229756206"/>
+      <w:bookmarkStart w:id="35" w:name="_Toc229757977"/>
       <w:r>
         <w:rPr>
           <w:rFonts w:ascii="Times New Roman" w:hAnsi="Times New Roman"/>
         </w:rPr>
         <w:t>4.3 Main Comparison at Validation-Normal q95</w:t>
       </w:r>
-      <w:bookmarkEnd w:id="34"/>
+      <w:bookmarkEnd w:id="35"/>
     </w:p>
     <w:p/>
     <w:p>
@@ -9447,7 +9449,7 @@
         <w:pStyle w:val="ResimYazs"/>
         <w:keepNext/>
       </w:pPr>
-      <w:bookmarkStart w:id="35" w:name="_Toc229756743"/>
+      <w:bookmarkStart w:id="36" w:name="_Toc229756743"/>
       <w:r>
         <w:t xml:space="preserve">Table </w:t>
       </w:r>
@@ -9465,7 +9467,7 @@
       <w:r>
         <w:t>Main trace-level comparison at validation-normal q95 thresholds.</w:t>
       </w:r>
-      <w:bookmarkEnd w:id="35"/>
+      <w:bookmarkEnd w:id="36"/>
     </w:p>
     <w:tbl>
       <w:tblPr>
@@ -10270,14 +10272,14 @@
           <w:numId w:val="0"/>
         </w:numPr>
       </w:pPr>
-      <w:bookmarkStart w:id="36" w:name="_Toc229756207"/>
+      <w:bookmarkStart w:id="37" w:name="_Toc229757978"/>
       <w:r>
         <w:rPr>
           <w:rFonts w:ascii="Times New Roman" w:hAnsi="Times New Roman"/>
         </w:rPr>
         <w:t>4.4 Confusion Matrix and Score Distribution Analysis</w:t>
       </w:r>
-      <w:bookmarkEnd w:id="36"/>
+      <w:bookmarkEnd w:id="37"/>
     </w:p>
     <w:p/>
     <w:p>
@@ -10332,7 +10334,7 @@
         <w:pStyle w:val="ResimYazs"/>
         <w:jc w:val="center"/>
       </w:pPr>
-      <w:bookmarkStart w:id="37" w:name="_Toc229757144"/>
+      <w:bookmarkStart w:id="38" w:name="_Toc229757144"/>
       <w:r>
         <w:t xml:space="preserve">Figure </w:t>
       </w:r>
@@ -10350,7 +10352,7 @@
       <w:r>
         <w:t>STIDE confusion matrix at q95.</w:t>
       </w:r>
-      <w:bookmarkEnd w:id="37"/>
+      <w:bookmarkEnd w:id="38"/>
     </w:p>
     <w:p>
       <w:pPr>
@@ -10409,7 +10411,7 @@
         <w:pStyle w:val="ResimYazs"/>
         <w:jc w:val="center"/>
       </w:pPr>
-      <w:bookmarkStart w:id="38" w:name="_Toc229757145"/>
+      <w:bookmarkStart w:id="39" w:name="_Toc229757145"/>
       <w:r>
         <w:t xml:space="preserve">Figure </w:t>
       </w:r>
@@ -10427,7 +10429,7 @@
       <w:r>
         <w:t>LSTM Syscall confusion matrix at q95.</w:t>
       </w:r>
-      <w:bookmarkEnd w:id="38"/>
+      <w:bookmarkEnd w:id="39"/>
     </w:p>
     <w:p>
       <w:pPr>
@@ -10486,7 +10488,7 @@
         <w:pStyle w:val="ResimYazs"/>
         <w:jc w:val="center"/>
       </w:pPr>
-      <w:bookmarkStart w:id="39" w:name="_Toc229757146"/>
+      <w:bookmarkStart w:id="40" w:name="_Toc229757146"/>
       <w:r>
         <w:t xml:space="preserve">Figure </w:t>
       </w:r>
@@ -10504,7 +10506,7 @@
       <w:r>
         <w:t>LSTM Context confusion matrix at q95.</w:t>
       </w:r>
-      <w:bookmarkEnd w:id="39"/>
+      <w:bookmarkEnd w:id="40"/>
     </w:p>
     <w:p>
       <w:pPr>
@@ -10563,7 +10565,7 @@
         <w:pStyle w:val="ResimYazs"/>
         <w:jc w:val="center"/>
       </w:pPr>
-      <w:bookmarkStart w:id="40" w:name="_Toc229757147"/>
+      <w:bookmarkStart w:id="41" w:name="_Toc229757147"/>
       <w:r>
         <w:t xml:space="preserve">Figure </w:t>
       </w:r>
@@ -10581,7 +10583,7 @@
       <w:r>
         <w:t>STIDE trace-score distribution.</w:t>
       </w:r>
-      <w:bookmarkEnd w:id="40"/>
+      <w:bookmarkEnd w:id="41"/>
     </w:p>
     <w:p>
       <w:pPr>
@@ -10639,7 +10641,7 @@
         <w:pStyle w:val="ResimYazs"/>
         <w:jc w:val="center"/>
       </w:pPr>
-      <w:bookmarkStart w:id="41" w:name="_Toc229757148"/>
+      <w:bookmarkStart w:id="42" w:name="_Toc229757148"/>
       <w:r>
         <w:t xml:space="preserve">Figure </w:t>
       </w:r>
@@ -10657,7 +10659,7 @@
       <w:r>
         <w:t>LSTM Syscall trace-score distribution.</w:t>
       </w:r>
-      <w:bookmarkEnd w:id="41"/>
+      <w:bookmarkEnd w:id="42"/>
     </w:p>
     <w:p>
       <w:pPr>
@@ -10715,7 +10717,7 @@
         <w:pStyle w:val="ResimYazs"/>
         <w:jc w:val="center"/>
       </w:pPr>
-      <w:bookmarkStart w:id="42" w:name="_Toc229757149"/>
+      <w:bookmarkStart w:id="43" w:name="_Toc229757149"/>
       <w:r>
         <w:t xml:space="preserve">Figure </w:t>
       </w:r>
@@ -10733,7 +10735,7 @@
       <w:r>
         <w:t>LSTM Context trace-score distribution.</w:t>
       </w:r>
-      <w:bookmarkEnd w:id="42"/>
+      <w:bookmarkEnd w:id="43"/>
     </w:p>
     <w:p>
       <w:pPr>
@@ -10757,14 +10759,14 @@
           <w:numId w:val="0"/>
         </w:numPr>
       </w:pPr>
-      <w:bookmarkStart w:id="43" w:name="_Toc229756208"/>
+      <w:bookmarkStart w:id="44" w:name="_Toc229757979"/>
       <w:r>
         <w:rPr>
           <w:rFonts w:ascii="Times New Roman" w:hAnsi="Times New Roman"/>
         </w:rPr>
         <w:t>4.5 Sensitivity Analysis with q90 Thresholds</w:t>
       </w:r>
-      <w:bookmarkEnd w:id="43"/>
+      <w:bookmarkEnd w:id="44"/>
     </w:p>
     <w:p/>
     <w:p/>
@@ -10773,7 +10775,7 @@
         <w:pStyle w:val="ResimYazs"/>
         <w:keepNext/>
       </w:pPr>
-      <w:bookmarkStart w:id="44" w:name="_Toc229756744"/>
+      <w:bookmarkStart w:id="45" w:name="_Toc229756744"/>
       <w:r>
         <w:t xml:space="preserve">Table </w:t>
       </w:r>
@@ -10791,7 +10793,7 @@
       <w:r>
         <w:t>Sensitivity comparison at validation-normal q90 thresholds.</w:t>
       </w:r>
-      <w:bookmarkEnd w:id="44"/>
+      <w:bookmarkEnd w:id="45"/>
     </w:p>
     <w:tbl>
       <w:tblPr>
@@ -11596,14 +11598,14 @@
           <w:numId w:val="0"/>
         </w:numPr>
       </w:pPr>
-      <w:bookmarkStart w:id="45" w:name="_Toc229756209"/>
+      <w:bookmarkStart w:id="46" w:name="_Toc229757980"/>
       <w:r>
         <w:rPr>
           <w:rFonts w:ascii="Times New Roman" w:hAnsi="Times New Roman"/>
         </w:rPr>
         <w:t>4.6 Original Thresholding and Reliability Summaries</w:t>
       </w:r>
-      <w:bookmarkEnd w:id="45"/>
+      <w:bookmarkEnd w:id="46"/>
     </w:p>
     <w:p>
       <w:pPr>
@@ -11618,7 +11620,7 @@
         <w:keepNext/>
         <w:jc w:val="center"/>
       </w:pPr>
-      <w:bookmarkStart w:id="46" w:name="_Toc229756745"/>
+      <w:bookmarkStart w:id="47" w:name="_Toc229756745"/>
       <w:r>
         <w:t xml:space="preserve">Table </w:t>
       </w:r>
@@ -11636,7 +11638,7 @@
       <w:r>
         <w:t>Original validation-based thresholding comparison (supporting).</w:t>
       </w:r>
-      <w:bookmarkEnd w:id="46"/>
+      <w:bookmarkEnd w:id="47"/>
     </w:p>
     <w:tbl>
       <w:tblPr>
@@ -12143,7 +12145,7 @@
         <w:pStyle w:val="ResimYazs"/>
         <w:keepNext/>
       </w:pPr>
-      <w:bookmarkStart w:id="47" w:name="_Toc229756746"/>
+      <w:bookmarkStart w:id="48" w:name="_Toc229756746"/>
       <w:r>
         <w:t xml:space="preserve">Table </w:t>
       </w:r>
@@ -12161,7 +12163,7 @@
       <w:r>
         <w:t>Bootstrap q95 reliability summary (mean metrics).</w:t>
       </w:r>
-      <w:bookmarkEnd w:id="47"/>
+      <w:bookmarkEnd w:id="48"/>
     </w:p>
     <w:tbl>
       <w:tblPr>
@@ -12683,7 +12685,7 @@
         <w:pStyle w:val="ResimYazs"/>
         <w:keepNext/>
       </w:pPr>
-      <w:bookmarkStart w:id="48" w:name="_Toc229756747"/>
+      <w:bookmarkStart w:id="49" w:name="_Toc229756747"/>
       <w:r>
         <w:t xml:space="preserve">Table </w:t>
       </w:r>
@@ -12701,7 +12703,7 @@
       <w:r>
         <w:t>Error analysis summary at q95.</w:t>
       </w:r>
-      <w:bookmarkEnd w:id="48"/>
+      <w:bookmarkEnd w:id="49"/>
     </w:p>
     <w:tbl>
       <w:tblPr>
@@ -13156,14 +13158,14 @@
           <w:numId w:val="0"/>
         </w:numPr>
       </w:pPr>
-      <w:bookmarkStart w:id="49" w:name="_Toc229756210"/>
+      <w:bookmarkStart w:id="50" w:name="_Toc229757981"/>
       <w:r>
         <w:rPr>
           <w:rFonts w:ascii="Times New Roman" w:hAnsi="Times New Roman"/>
         </w:rPr>
         <w:t>4.7 Summary of Findings</w:t>
       </w:r>
-      <w:bookmarkEnd w:id="49"/>
+      <w:bookmarkEnd w:id="50"/>
     </w:p>
     <w:p>
       <w:r>
@@ -13332,7 +13334,7 @@
         </w:numPr>
         <w:ind w:left="360"/>
       </w:pPr>
-      <w:bookmarkStart w:id="50" w:name="_Toc229756211"/>
+      <w:bookmarkStart w:id="51" w:name="_Toc229757982"/>
       <w:r>
         <w:lastRenderedPageBreak/>
         <w:t>5</w:t>
@@ -13343,7 +13345,7 @@
       <w:r>
         <w:t xml:space="preserve"> Discussion and Conslusion</w:t>
       </w:r>
-      <w:bookmarkEnd w:id="50"/>
+      <w:bookmarkEnd w:id="51"/>
     </w:p>
     <w:p>
       <w:pPr>
@@ -13358,7 +13360,7 @@
           <w:i/>
         </w:rPr>
       </w:pPr>
-      <w:bookmarkStart w:id="51" w:name="_Toc229756212"/>
+      <w:bookmarkStart w:id="52" w:name="_Toc229757983"/>
       <w:r>
         <w:rPr>
           <w:rStyle w:val="Balk2Char"/>
@@ -13366,7 +13368,7 @@
         </w:rPr>
         <w:t>5.1 Discussion of Key Findings</w:t>
       </w:r>
-      <w:bookmarkEnd w:id="51"/>
+      <w:bookmarkEnd w:id="52"/>
     </w:p>
     <w:p>
       <w:r>
@@ -13384,14 +13386,14 @@
           <w:numId w:val="0"/>
         </w:numPr>
       </w:pPr>
-      <w:bookmarkStart w:id="52" w:name="_Toc229756213"/>
+      <w:bookmarkStart w:id="53" w:name="_Toc229757984"/>
       <w:r>
         <w:rPr>
           <w:rFonts w:ascii="Times New Roman" w:hAnsi="Times New Roman"/>
         </w:rPr>
         <w:t>5.2 Practical Implications</w:t>
       </w:r>
-      <w:bookmarkEnd w:id="52"/>
+      <w:bookmarkEnd w:id="53"/>
     </w:p>
     <w:p>
       <w:r>
@@ -13412,14 +13414,14 @@
           <w:tab w:val="left" w:pos="540"/>
         </w:tabs>
       </w:pPr>
-      <w:bookmarkStart w:id="53" w:name="_Toc229756214"/>
+      <w:bookmarkStart w:id="54" w:name="_Toc229757985"/>
       <w:r>
         <w:rPr>
           <w:rFonts w:ascii="Times New Roman" w:hAnsi="Times New Roman"/>
         </w:rPr>
         <w:t>5.3 Limitations</w:t>
       </w:r>
-      <w:bookmarkEnd w:id="53"/>
+      <w:bookmarkEnd w:id="54"/>
     </w:p>
     <w:p>
       <w:r>
@@ -13437,14 +13439,14 @@
           <w:numId w:val="0"/>
         </w:numPr>
       </w:pPr>
-      <w:bookmarkStart w:id="54" w:name="_Toc229756215"/>
+      <w:bookmarkStart w:id="55" w:name="_Toc229757986"/>
       <w:r>
         <w:rPr>
           <w:rFonts w:ascii="Times New Roman" w:hAnsi="Times New Roman"/>
         </w:rPr>
         <w:t>5.4 Future Work</w:t>
       </w:r>
-      <w:bookmarkEnd w:id="54"/>
+      <w:bookmarkEnd w:id="55"/>
     </w:p>
     <w:p>
       <w:r>
@@ -13463,14 +13465,14 @@
         </w:numPr>
         <w:ind w:left="360" w:hanging="360"/>
       </w:pPr>
-      <w:bookmarkStart w:id="55" w:name="_Toc229756216"/>
+      <w:bookmarkStart w:id="56" w:name="_Toc229757987"/>
       <w:r>
         <w:rPr>
           <w:rFonts w:ascii="Times New Roman" w:hAnsi="Times New Roman"/>
         </w:rPr>
         <w:t>5.5 Conclusion</w:t>
       </w:r>
-      <w:bookmarkEnd w:id="55"/>
+      <w:bookmarkEnd w:id="56"/>
     </w:p>
     <w:p>
       <w:r>
@@ -13642,7 +13644,7 @@
         <w:pStyle w:val="ResimYazs"/>
         <w:jc w:val="center"/>
       </w:pPr>
-      <w:bookmarkStart w:id="56" w:name="_Toc229757150"/>
+      <w:bookmarkStart w:id="57" w:name="_Toc229757150"/>
       <w:r>
         <w:t xml:space="preserve">Figure </w:t>
       </w:r>
@@ -13660,7 +13662,7 @@
       <w:r>
         <w:t>Example false-positive trace profile (q95, LSTM Syscall).</w:t>
       </w:r>
-      <w:bookmarkEnd w:id="56"/>
+      <w:bookmarkEnd w:id="57"/>
     </w:p>
     <w:p>
       <w:pPr>

</xml_diff>